<commit_message>
CV: add clickable portfolio link (basant-kumar-portfoli.netlify.app)
Co-Authored-By: Claude Opus 5.5 <noreply@anthropic.com>
Claude-Session: https://claude.ai/code/session_01AU5zbZtAWEYqmaeob7qkq7
</commit_message>
<xml_diff>
--- a/cv/Basant_Kumar_CV.docx
+++ b/cv/Basant_Kumar_CV.docx
@@ -48,7 +48,7 @@
         </w:rPr>
         <w:t xml:space="preserve">Celbridge, Co. Kildare, Ireland  ·  </w:t>
       </w:r>
-      <w:hyperlink w:history="1" r:id="rIdcw5w3pii1smqh5e3jiu7b">
+      <w:hyperlink w:history="1" r:id="rIdnygiphwuijr5zjzjexkur">
         <w:r>
           <w:rPr>
             <w:rFonts w:ascii="Arial" w:cs="Arial" w:eastAsia="Arial" w:hAnsi="Arial"/>
@@ -65,7 +65,32 @@
         <w:spacing w:after="40"/>
         <w:jc w:val="center"/>
       </w:pPr>
-      <w:hyperlink w:history="1" r:id="rId5efcjupkejwtqbx1jrmfj">
+      <w:r>
+        <w:rPr>
+          <w:rFonts w:ascii="Arial" w:cs="Arial" w:eastAsia="Arial" w:hAnsi="Arial"/>
+          <w:sz w:val="22"/>
+          <w:szCs w:val="22"/>
+        </w:rPr>
+        <w:t xml:space="preserve">Portfolio: </w:t>
+      </w:r>
+      <w:hyperlink w:history="1" r:id="rIdby89gna06qbydgncbkt-u">
+        <w:r>
+          <w:rPr>
+            <w:rFonts w:ascii="Arial" w:cs="Arial" w:eastAsia="Arial" w:hAnsi="Arial"/>
+            <w:color w:val="1F4E79"/>
+            <w:sz w:val="22"/>
+            <w:szCs w:val="22"/>
+          </w:rPr>
+          <w:t xml:space="preserve">basant-kumar-portfoli.netlify.app</w:t>
+        </w:r>
+      </w:hyperlink>
+    </w:p>
+    <w:p>
+      <w:pPr>
+        <w:spacing w:after="40"/>
+        <w:jc w:val="center"/>
+      </w:pPr>
+      <w:hyperlink w:history="1" r:id="rId9ja45y57xzlj22-ac91pe">
         <w:r>
           <w:rPr>
             <w:rFonts w:ascii="Arial" w:cs="Arial" w:eastAsia="Arial" w:hAnsi="Arial"/>
@@ -84,7 +109,7 @@
         </w:rPr>
         <w:t xml:space="preserve">  ·  </w:t>
       </w:r>
-      <w:hyperlink w:history="1" r:id="rIdyfwfdo4dlajygpl8p-bik">
+      <w:hyperlink w:history="1" r:id="rIdnqc7t2bbpmqtcgxsgwoka">
         <w:r>
           <w:rPr>
             <w:rFonts w:ascii="Arial" w:cs="Arial" w:eastAsia="Arial" w:hAnsi="Arial"/>

</xml_diff>

<commit_message>
CV: labelled contact links (Portfolio, LinkedIn, GitHub)
The header shows the words Portfolio, LinkedIn and GitHub as hyperlinks
instead of raw addresses; the email address stays visible and clickable.

Co-Authored-By: Claude Opus 5.5 <noreply@anthropic.com>
Claude-Session: https://claude.ai/code/session_01AU5zbZtAWEYqmaeob7qkq7
</commit_message>
<xml_diff>
--- a/cv/Basant_Kumar_CV.docx
+++ b/cv/Basant_Kumar_CV.docx
@@ -48,7 +48,7 @@
         </w:rPr>
         <w:t xml:space="preserve">Celbridge, Co. Kildare, Ireland  ·  </w:t>
       </w:r>
-      <w:hyperlink w:history="1" r:id="rIdnygiphwuijr5zjzjexkur">
+      <w:hyperlink w:history="1" r:id="rIdqb8bsaeb5bqeovkaijbhx">
         <w:r>
           <w:rPr>
             <w:rFonts w:ascii="Arial" w:cs="Arial" w:eastAsia="Arial" w:hAnsi="Arial"/>
@@ -65,15 +65,7 @@
         <w:spacing w:after="40"/>
         <w:jc w:val="center"/>
       </w:pPr>
-      <w:r>
-        <w:rPr>
-          <w:rFonts w:ascii="Arial" w:cs="Arial" w:eastAsia="Arial" w:hAnsi="Arial"/>
-          <w:sz w:val="22"/>
-          <w:szCs w:val="22"/>
-        </w:rPr>
-        <w:t xml:space="preserve">Portfolio: </w:t>
-      </w:r>
-      <w:hyperlink w:history="1" r:id="rIdby89gna06qbydgncbkt-u">
+      <w:hyperlink w:history="1" r:id="rId9v58dypzhdsjyjigq58wy">
         <w:r>
           <w:rPr>
             <w:rFonts w:ascii="Arial" w:cs="Arial" w:eastAsia="Arial" w:hAnsi="Arial"/>
@@ -81,16 +73,18 @@
             <w:sz w:val="22"/>
             <w:szCs w:val="22"/>
           </w:rPr>
-          <w:t xml:space="preserve">basant-kumar-portfoli.netlify.app</w:t>
+          <w:t xml:space="preserve">Portfolio</w:t>
         </w:r>
       </w:hyperlink>
-    </w:p>
-    <w:p>
-      <w:pPr>
-        <w:spacing w:after="40"/>
-        <w:jc w:val="center"/>
-      </w:pPr>
-      <w:hyperlink w:history="1" r:id="rId9ja45y57xzlj22-ac91pe">
+      <w:r>
+        <w:rPr>
+          <w:rFonts w:ascii="Arial" w:cs="Arial" w:eastAsia="Arial" w:hAnsi="Arial"/>
+          <w:sz w:val="22"/>
+          <w:szCs w:val="22"/>
+        </w:rPr>
+        <w:t xml:space="preserve">  ·  </w:t>
+      </w:r>
+      <w:hyperlink w:history="1" r:id="rIdug4pjg-7iyva-g1vfdrfz">
         <w:r>
           <w:rPr>
             <w:rFonts w:ascii="Arial" w:cs="Arial" w:eastAsia="Arial" w:hAnsi="Arial"/>
@@ -98,7 +92,7 @@
             <w:sz w:val="22"/>
             <w:szCs w:val="22"/>
           </w:rPr>
-          <w:t xml:space="preserve">linkedin.com/in/basantsingh-</w:t>
+          <w:t xml:space="preserve">LinkedIn</w:t>
         </w:r>
       </w:hyperlink>
       <w:r>
@@ -109,7 +103,7 @@
         </w:rPr>
         <w:t xml:space="preserve">  ·  </w:t>
       </w:r>
-      <w:hyperlink w:history="1" r:id="rIdnqc7t2bbpmqtcgxsgwoka">
+      <w:hyperlink w:history="1" r:id="rIdpm3twmpkdikdkvh66ggoi">
         <w:r>
           <w:rPr>
             <w:rFonts w:ascii="Arial" w:cs="Arial" w:eastAsia="Arial" w:hAnsi="Arial"/>
@@ -117,7 +111,7 @@
             <w:sz w:val="22"/>
             <w:szCs w:val="22"/>
           </w:rPr>
-          <w:t xml:space="preserve">github.com/basant-kumarr</w:t>
+          <w:t xml:space="preserve">GitHub</w:t>
         </w:r>
       </w:hyperlink>
     </w:p>

</xml_diff>

<commit_message>
Correct certifications against the certificate PDF; lead skills with Python, SQL, R, Tableau
Verified every entry against the uploaded certificates. AI For Everyone is
dated September 2023, not 2025, and the Google Project Management
Professional Certificate (six courses, June 2022) is confirmed complete.
Separates professional certificates from individual course completions and
the be10x one-day Power BI workshop, which is not a certification.

Skills now lead with the four tools used most, each described by what it is
used for. The CV stays at two pages: its entry groups may now split across
the page break, which recovered the space the longer certification block
needed.

Co-Authored-By: Claude Opus 5 <noreply@anthropic.com>
Claude-Session: https://claude.ai/code/session_01AU5zbZtAWEYqmaeob7qkq7
</commit_message>
<xml_diff>
--- a/cv/Basant_Kumar_CV.docx
+++ b/cv/Basant_Kumar_CV.docx
@@ -48,7 +48,7 @@
         </w:rPr>
         <w:t xml:space="preserve">Celbridge, Co. Kildare, Ireland  ·  </w:t>
       </w:r>
-      <w:hyperlink w:history="1" r:id="rIdqb8bsaeb5bqeovkaijbhx">
+      <w:hyperlink w:history="1" r:id="rIddtpy_4wxqribalpg9xc84">
         <w:r>
           <w:rPr>
             <w:rFonts w:ascii="Arial" w:cs="Arial" w:eastAsia="Arial" w:hAnsi="Arial"/>
@@ -65,7 +65,7 @@
         <w:spacing w:after="40"/>
         <w:jc w:val="center"/>
       </w:pPr>
-      <w:hyperlink w:history="1" r:id="rId9v58dypzhdsjyjigq58wy">
+      <w:hyperlink w:history="1" r:id="rIdwb_eyycjsnn4srbexi2-v">
         <w:r>
           <w:rPr>
             <w:rFonts w:ascii="Arial" w:cs="Arial" w:eastAsia="Arial" w:hAnsi="Arial"/>
@@ -84,7 +84,7 @@
         </w:rPr>
         <w:t xml:space="preserve">  ·  </w:t>
       </w:r>
-      <w:hyperlink w:history="1" r:id="rIdug4pjg-7iyva-g1vfdrfz">
+      <w:hyperlink w:history="1" r:id="rIdtnllewd_tfhor9-1uqgqq">
         <w:r>
           <w:rPr>
             <w:rFonts w:ascii="Arial" w:cs="Arial" w:eastAsia="Arial" w:hAnsi="Arial"/>
@@ -103,7 +103,7 @@
         </w:rPr>
         <w:t xml:space="preserve">  ·  </w:t>
       </w:r>
-      <w:hyperlink w:history="1" r:id="rIdpm3twmpkdikdkvh66ggoi">
+      <w:hyperlink w:history="1" r:id="rIdtlz2bhhkldspnwrmtglux">
         <w:r>
           <w:rPr>
             <w:rFonts w:ascii="Arial" w:cs="Arial" w:eastAsia="Arial" w:hAnsi="Arial"/>
@@ -1178,7 +1178,7 @@
           <w:sz w:val="22"/>
           <w:szCs w:val="22"/>
         </w:rPr>
-        <w:t xml:space="preserve">SQL, Python, R, Excel, Power Query, Power BI, Tableau, MySQL</w:t>
+        <w:t xml:space="preserve">Python (analysis, feature engineering, ML), SQL (querying, data extraction), R (statistics, visualisation, forecasting), Tableau (dashboards, reporting), Power BI, Excel, Power Query, MySQL</w:t>
       </w:r>
     </w:p>
     <w:p>
@@ -1286,16 +1286,16 @@
           <w:sz w:val="22"/>
           <w:szCs w:val="22"/>
         </w:rPr>
-        <w:t xml:space="preserve">Machine Learning Professional</w:t>
-      </w:r>
-      <w:r>
-        <w:rPr>
-          <w:rFonts w:ascii="Arial" w:cs="Arial" w:eastAsia="Arial" w:hAnsi="Arial"/>
-          <w:color w:val="444444"/>
-          <w:sz w:val="22"/>
-          <w:szCs w:val="22"/>
-        </w:rPr>
-        <w:t xml:space="preserve">	Altair / RapidMiner, 2025</w:t>
+        <w:t xml:space="preserve">Google Data Analytics Professional Certificate</w:t>
+      </w:r>
+      <w:r>
+        <w:rPr>
+          <w:rFonts w:ascii="Arial" w:cs="Arial" w:eastAsia="Arial" w:hAnsi="Arial"/>
+          <w:color w:val="444444"/>
+          <w:sz w:val="22"/>
+          <w:szCs w:val="22"/>
+        </w:rPr>
+        <w:t xml:space="preserve">	Google, 2024</w:t>
       </w:r>
     </w:p>
     <w:p>
@@ -1313,16 +1313,16 @@
           <w:sz w:val="22"/>
           <w:szCs w:val="22"/>
         </w:rPr>
-        <w:t xml:space="preserve">Google Data Analytics Professional Certificate</w:t>
-      </w:r>
-      <w:r>
-        <w:rPr>
-          <w:rFonts w:ascii="Arial" w:cs="Arial" w:eastAsia="Arial" w:hAnsi="Arial"/>
-          <w:color w:val="444444"/>
-          <w:sz w:val="22"/>
-          <w:szCs w:val="22"/>
-        </w:rPr>
-        <w:t xml:space="preserve">	Google, 2024</w:t>
+        <w:t xml:space="preserve">Google Project Management Professional Certificate (six courses)</w:t>
+      </w:r>
+      <w:r>
+        <w:rPr>
+          <w:rFonts w:ascii="Arial" w:cs="Arial" w:eastAsia="Arial" w:hAnsi="Arial"/>
+          <w:color w:val="444444"/>
+          <w:sz w:val="22"/>
+          <w:szCs w:val="22"/>
+        </w:rPr>
+        <w:t xml:space="preserve">	Google, 2022</w:t>
       </w:r>
     </w:p>
     <w:p>
@@ -1340,43 +1340,39 @@
           <w:sz w:val="22"/>
           <w:szCs w:val="22"/>
         </w:rPr>
-        <w:t xml:space="preserve">AI For Everyone</w:t>
-      </w:r>
-      <w:r>
-        <w:rPr>
-          <w:rFonts w:ascii="Arial" w:cs="Arial" w:eastAsia="Arial" w:hAnsi="Arial"/>
-          <w:color w:val="444444"/>
-          <w:sz w:val="22"/>
-          <w:szCs w:val="22"/>
-        </w:rPr>
-        <w:t xml:space="preserve">	2025</w:t>
-      </w:r>
-    </w:p>
-    <w:p>
-      <w:pPr>
-        <w:tabs>
-          <w:tab w:val="right" w:pos="9890"/>
-        </w:tabs>
-        <w:spacing w:after="30"/>
-      </w:pPr>
-      <w:r>
-        <w:rPr>
-          <w:rFonts w:ascii="Arial" w:cs="Arial" w:eastAsia="Arial" w:hAnsi="Arial"/>
-          <w:b/>
-          <w:bCs/>
-          <w:sz w:val="22"/>
-          <w:szCs w:val="22"/>
-        </w:rPr>
-        <w:t xml:space="preserve">Google Project Management Certificate</w:t>
-      </w:r>
-      <w:r>
-        <w:rPr>
-          <w:rFonts w:ascii="Arial" w:cs="Arial" w:eastAsia="Arial" w:hAnsi="Arial"/>
-          <w:color w:val="444444"/>
-          <w:sz w:val="22"/>
-          <w:szCs w:val="22"/>
-        </w:rPr>
-        <w:t xml:space="preserve">	Google</w:t>
+        <w:t xml:space="preserve">Machine Learning Professional</w:t>
+      </w:r>
+      <w:r>
+        <w:rPr>
+          <w:rFonts w:ascii="Arial" w:cs="Arial" w:eastAsia="Arial" w:hAnsi="Arial"/>
+          <w:color w:val="444444"/>
+          <w:sz w:val="22"/>
+          <w:szCs w:val="22"/>
+        </w:rPr>
+        <w:t xml:space="preserve">	Altair / RapidMiner, 2025</w:t>
+      </w:r>
+    </w:p>
+    <w:p>
+      <w:pPr>
+        <w:spacing w:after="40"/>
+      </w:pPr>
+      <w:r>
+        <w:rPr>
+          <w:rFonts w:ascii="Arial" w:cs="Arial" w:eastAsia="Arial" w:hAnsi="Arial"/>
+          <w:b/>
+          <w:bCs/>
+          <w:sz w:val="22"/>
+          <w:szCs w:val="22"/>
+        </w:rPr>
+        <w:t xml:space="preserve">Courses: </w:t>
+      </w:r>
+      <w:r>
+        <w:rPr>
+          <w:rFonts w:ascii="Arial" w:cs="Arial" w:eastAsia="Arial" w:hAnsi="Arial"/>
+          <w:sz w:val="22"/>
+          <w:szCs w:val="22"/>
+        </w:rPr>
+        <w:t xml:space="preserve">AI For Everyone, DeepLearning.AI (2023) · Programming for Everybody, University of Michigan (2019) · Six Sigma Principles, University System of Georgia (2023) · Supply Chain Management Strategy, Rutgers (2022) · Power BI, be10x one-day workshop (2023)</w:t>
       </w:r>
     </w:p>
     <w:p>

</xml_diff>

<commit_message>
MSc awarded; drop the two certifications removed from the profile
Maynooth transcript gives award date 14 October 2026, Second Class
Honours Grade I, so "award pending" is replaced across the CV and the
portfolio. Also removes the Google Data Analytics Professional
Certificate and the Altair/RapidMiner Machine Learning Professional
entry, matching commit 0668f8d on main, which dropped both pending
evidence. The CV stays at two pages.

Co-Authored-By: Claude Opus 5 <noreply@anthropic.com>
Claude-Session: https://claude.ai/code/session_01AU5zbZtAWEYqmaeob7qkq7
</commit_message>
<xml_diff>
--- a/cv/Basant_Kumar_CV.docx
+++ b/cv/Basant_Kumar_CV.docx
@@ -48,7 +48,7 @@
         </w:rPr>
         <w:t xml:space="preserve">Celbridge, Co. Kildare, Ireland  ·  </w:t>
       </w:r>
-      <w:hyperlink w:history="1" r:id="rIddtpy_4wxqribalpg9xc84">
+      <w:hyperlink w:history="1" r:id="rId7p6bfi61-vahj9q8fzbys">
         <w:r>
           <w:rPr>
             <w:rFonts w:ascii="Arial" w:cs="Arial" w:eastAsia="Arial" w:hAnsi="Arial"/>
@@ -65,7 +65,7 @@
         <w:spacing w:after="40"/>
         <w:jc w:val="center"/>
       </w:pPr>
-      <w:hyperlink w:history="1" r:id="rIdwb_eyycjsnn4srbexi2-v">
+      <w:hyperlink w:history="1" r:id="rIdnwzcb1rlez4aj5j1bueh2">
         <w:r>
           <w:rPr>
             <w:rFonts w:ascii="Arial" w:cs="Arial" w:eastAsia="Arial" w:hAnsi="Arial"/>
@@ -84,7 +84,7 @@
         </w:rPr>
         <w:t xml:space="preserve">  ·  </w:t>
       </w:r>
-      <w:hyperlink w:history="1" r:id="rIdtnllewd_tfhor9-1uqgqq">
+      <w:hyperlink w:history="1" r:id="rIdsgj7kav3hehtonclr6ngd">
         <w:r>
           <w:rPr>
             <w:rFonts w:ascii="Arial" w:cs="Arial" w:eastAsia="Arial" w:hAnsi="Arial"/>
@@ -103,7 +103,7 @@
         </w:rPr>
         <w:t xml:space="preserve">  ·  </w:t>
       </w:r>
-      <w:hyperlink w:history="1" r:id="rIdtlz2bhhkldspnwrmtglux">
+      <w:hyperlink w:history="1" r:id="rId-6poivc-z8hyh28lprolw">
         <w:r>
           <w:rPr>
             <w:rFonts w:ascii="Arial" w:cs="Arial" w:eastAsia="Arial" w:hAnsi="Arial"/>
@@ -146,7 +146,7 @@
           <w:sz w:val="22"/>
           <w:szCs w:val="22"/>
         </w:rPr>
-        <w:t xml:space="preserve">Business analytics graduate with an electronics engineering background, working across business problems, data and AI. I completed the MSc in Business Analytics at Maynooth University in 2026 (award pending), after R&amp;D work in IoT and analytics and research reporting at Maynooth. I like framing the problem with stakeholders first, getting the data into a state worth trusting, modelling it, and turning the result into something people can use. Seeking Business Analyst, Data Analyst, BI Analyst and AI/Product Analyst roles in Ireland.</w:t>
+        <w:t xml:space="preserve">Business analytics graduate with an electronics engineering background, working across business problems, data and AI. I hold an MSc in Business Analytics from Maynooth University, awarded in 2026, after R&amp;D work in IoT and analytics and research reporting at Maynooth. I like framing the problem with stakeholders first, getting the data into a state worth trusting, modelling it, and turning the result into something people can use. Seeking Business Analyst, Data Analyst, BI Analyst and AI/Product Analyst roles in Ireland.</w:t>
       </w:r>
     </w:p>
     <w:p>
@@ -212,7 +212,7 @@
           <w:sz w:val="22"/>
           <w:szCs w:val="22"/>
         </w:rPr>
-        <w:t xml:space="preserve">Programme completed 2026; award pending</w:t>
+        <w:t xml:space="preserve">Awarded October 2026 · Second Class Honours, Grade I</w:t>
       </w:r>
     </w:p>
     <w:p>
@@ -1286,33 +1286,6 @@
           <w:sz w:val="22"/>
           <w:szCs w:val="22"/>
         </w:rPr>
-        <w:t xml:space="preserve">Google Data Analytics Professional Certificate</w:t>
-      </w:r>
-      <w:r>
-        <w:rPr>
-          <w:rFonts w:ascii="Arial" w:cs="Arial" w:eastAsia="Arial" w:hAnsi="Arial"/>
-          <w:color w:val="444444"/>
-          <w:sz w:val="22"/>
-          <w:szCs w:val="22"/>
-        </w:rPr>
-        <w:t xml:space="preserve">	Google, 2024</w:t>
-      </w:r>
-    </w:p>
-    <w:p>
-      <w:pPr>
-        <w:tabs>
-          <w:tab w:val="right" w:pos="9890"/>
-        </w:tabs>
-        <w:spacing w:after="30"/>
-      </w:pPr>
-      <w:r>
-        <w:rPr>
-          <w:rFonts w:ascii="Arial" w:cs="Arial" w:eastAsia="Arial" w:hAnsi="Arial"/>
-          <w:b/>
-          <w:bCs/>
-          <w:sz w:val="22"/>
-          <w:szCs w:val="22"/>
-        </w:rPr>
         <w:t xml:space="preserve">Google Project Management Professional Certificate (six courses)</w:t>
       </w:r>
       <w:r>
@@ -1323,33 +1296,6 @@
           <w:szCs w:val="22"/>
         </w:rPr>
         <w:t xml:space="preserve">	Google, 2022</w:t>
-      </w:r>
-    </w:p>
-    <w:p>
-      <w:pPr>
-        <w:tabs>
-          <w:tab w:val="right" w:pos="9890"/>
-        </w:tabs>
-        <w:spacing w:after="30"/>
-      </w:pPr>
-      <w:r>
-        <w:rPr>
-          <w:rFonts w:ascii="Arial" w:cs="Arial" w:eastAsia="Arial" w:hAnsi="Arial"/>
-          <w:b/>
-          <w:bCs/>
-          <w:sz w:val="22"/>
-          <w:szCs w:val="22"/>
-        </w:rPr>
-        <w:t xml:space="preserve">Machine Learning Professional</w:t>
-      </w:r>
-      <w:r>
-        <w:rPr>
-          <w:rFonts w:ascii="Arial" w:cs="Arial" w:eastAsia="Arial" w:hAnsi="Arial"/>
-          <w:color w:val="444444"/>
-          <w:sz w:val="22"/>
-          <w:szCs w:val="22"/>
-        </w:rPr>
-        <w:t xml:space="preserve">	Altair / RapidMiner, 2025</w:t>
       </w:r>
     </w:p>
     <w:p>

</xml_diff>

<commit_message>
CV and site: new portfolio URL, plus the 20 Oct released wording
Points the CV contact line at basant-kumar.netlify.app and rebuilds the
PDF and DOCX. Also brings the 20 October release wording into the repo,
which until now existed only in the delivered ZIP: the MSc status reads
"Awarded 14 Oct 2026 · Second Class Honours, Grade 1" and the unverified
"10+" project count reads "5 Featured".

Co-Authored-By: Claude Opus 5 <noreply@anthropic.com>
Claude-Session: https://claude.ai/code/session_01AU5zbZtAWEYqmaeob7qkq7
</commit_message>
<xml_diff>
--- a/cv/Basant_Kumar_CV.docx
+++ b/cv/Basant_Kumar_CV.docx
@@ -48,7 +48,7 @@
         </w:rPr>
         <w:t xml:space="preserve">Celbridge, Co. Kildare, Ireland  ·  </w:t>
       </w:r>
-      <w:hyperlink w:history="1" r:id="rId7p6bfi61-vahj9q8fzbys">
+      <w:hyperlink w:history="1" r:id="rIdc8-0zfdknfa4yhcavyh5g">
         <w:r>
           <w:rPr>
             <w:rFonts w:ascii="Arial" w:cs="Arial" w:eastAsia="Arial" w:hAnsi="Arial"/>
@@ -65,7 +65,7 @@
         <w:spacing w:after="40"/>
         <w:jc w:val="center"/>
       </w:pPr>
-      <w:hyperlink w:history="1" r:id="rIdnwzcb1rlez4aj5j1bueh2">
+      <w:hyperlink w:history="1" r:id="rIdlin596kux69dxgee3bq2c">
         <w:r>
           <w:rPr>
             <w:rFonts w:ascii="Arial" w:cs="Arial" w:eastAsia="Arial" w:hAnsi="Arial"/>
@@ -84,7 +84,7 @@
         </w:rPr>
         <w:t xml:space="preserve">  ·  </w:t>
       </w:r>
-      <w:hyperlink w:history="1" r:id="rIdsgj7kav3hehtonclr6ngd">
+      <w:hyperlink w:history="1" r:id="rIdar3wb-3a7wukxu-hqgidg">
         <w:r>
           <w:rPr>
             <w:rFonts w:ascii="Arial" w:cs="Arial" w:eastAsia="Arial" w:hAnsi="Arial"/>
@@ -103,7 +103,7 @@
         </w:rPr>
         <w:t xml:space="preserve">  ·  </w:t>
       </w:r>
-      <w:hyperlink w:history="1" r:id="rId-6poivc-z8hyh28lprolw">
+      <w:hyperlink w:history="1" r:id="rIdoz3iffzw-d7kvyhtkyceh">
         <w:r>
           <w:rPr>
             <w:rFonts w:ascii="Arial" w:cs="Arial" w:eastAsia="Arial" w:hAnsi="Arial"/>

</xml_diff>